<commit_message>
fix: refresh hiring profile and add a genuine Drift preview
Correct completed-study status, expose the confirmed LinkedIn profile and full-time availability, and synchronize the CV downloads. Preserve the design and distinguish a genuine local interface capture from a model-run demonstration. Exact-lock release checks remain mandatory; the pre-existing contact-service failure is documented.
</commit_message>
<xml_diff>
--- a/public/resume.docx
+++ b/public/resume.docx
@@ -41,7 +41,7 @@
           <w:color w:val="3E4A54"/>
           <w:sz w:val="17"/>
         </w:rPr>
-        <w:t>Kenya | EAT (UTC+3) | Open to remote opportunities</w:t>
+        <w:t>Kenya | EAT (UTC+3) | Available for full-time remote work</w:t>
       </w:r>
     </w:p>
     <w:p>
@@ -76,6 +76,22 @@
     </w:p>
     <w:p>
       <w:pPr>
+        <w:keepNext w:val="0"/>
+        <w:widowControl/>
+        <w:spacing w:line="210" w:lineRule="exact"/>
+      </w:pPr>
+      <w:hyperlink r:id="rId14">
+        <w:r>
+          <w:rPr>
+            <w:color w:val="0F766E"/>
+            <w:sz w:val="17"/>
+          </w:rPr>
+          <w:t>https://www.linkedin.com/in/dismas-muriuki-b970b91b7</w:t>
+        </w:r>
+      </w:hyperlink>
+    </w:p>
+    <w:p>
+      <w:pPr>
         <w:keepNext/>
         <w:widowControl/>
         <w:spacing w:before="140" w:after="40"/>
@@ -101,7 +117,7 @@
         <w:rPr>
           <w:b w:val="0"/>
         </w:rPr>
-        <w:t>Computer Science undergraduate and self-directed developer working on AI gateways, agent runtimes and web applications. Project experience spans TypeScript, Python, Rust and Solidity, with a focus on modular architecture, API integration and developer tooling. Seeking junior software development opportunities.</w:t>
+        <w:t>Software developer in Kenya building web applications and AI tools. Independent projects use TypeScript, React, Python and Rust, with work on APIs, model routing and agent execution. Available for full-time remote software development roles.</w:t>
       </w:r>
     </w:p>
     <w:p>
@@ -554,7 +570,7 @@
         <w:rPr>
           <w:b w:val="0"/>
         </w:rPr>
-        <w:t>BSc Computer Science (in progress) — Murang'a University of Technology | Expected graduation: 2027</w:t>
+        <w:t>BSc Computer Science — Murang'a University of Technology. Studies completed; degree award expected in 2027.</w:t>
       </w:r>
     </w:p>
     <w:p>

</xml_diff>

<commit_message>
Refresh hiring details and add a genuine Drift interface preview (#3)
* fix: refresh hiring profile and add a genuine Drift preview

Correct completed-study status, expose the confirmed LinkedIn profile and full-time availability, and synchronize the CV downloads. Preserve the design and distinguish a genuine local interface capture from a model-run demonstration. Exact-lock release checks remain mandatory; the pre-existing contact-service failure is documented.

* ci: trigger preview for the ready portfolio PR

---------

Co-authored-by: danny-dis <danny-dis@users.noreply.github.com>
</commit_message>
<xml_diff>
--- a/public/resume.docx
+++ b/public/resume.docx
@@ -41,7 +41,7 @@
           <w:color w:val="3E4A54"/>
           <w:sz w:val="17"/>
         </w:rPr>
-        <w:t>Kenya | EAT (UTC+3) | Open to remote opportunities</w:t>
+        <w:t>Kenya | EAT (UTC+3) | Available for full-time remote work</w:t>
       </w:r>
     </w:p>
     <w:p>
@@ -76,6 +76,22 @@
     </w:p>
     <w:p>
       <w:pPr>
+        <w:keepNext w:val="0"/>
+        <w:widowControl/>
+        <w:spacing w:line="210" w:lineRule="exact"/>
+      </w:pPr>
+      <w:hyperlink r:id="rId14">
+        <w:r>
+          <w:rPr>
+            <w:color w:val="0F766E"/>
+            <w:sz w:val="17"/>
+          </w:rPr>
+          <w:t>https://www.linkedin.com/in/dismas-muriuki-b970b91b7</w:t>
+        </w:r>
+      </w:hyperlink>
+    </w:p>
+    <w:p>
+      <w:pPr>
         <w:keepNext/>
         <w:widowControl/>
         <w:spacing w:before="140" w:after="40"/>
@@ -101,7 +117,7 @@
         <w:rPr>
           <w:b w:val="0"/>
         </w:rPr>
-        <w:t>Computer Science undergraduate and self-directed developer working on AI gateways, agent runtimes and web applications. Project experience spans TypeScript, Python, Rust and Solidity, with a focus on modular architecture, API integration and developer tooling. Seeking junior software development opportunities.</w:t>
+        <w:t>Software developer in Kenya building web applications and AI tools. Independent projects use TypeScript, React, Python and Rust, with work on APIs, model routing and agent execution. Available for full-time remote software development roles.</w:t>
       </w:r>
     </w:p>
     <w:p>
@@ -554,7 +570,7 @@
         <w:rPr>
           <w:b w:val="0"/>
         </w:rPr>
-        <w:t>BSc Computer Science (in progress) — Murang'a University of Technology | Expected graduation: 2027</w:t>
+        <w:t>BSc Computer Science — Murang'a University of Technology. Studies completed; degree award expected in 2027.</w:t>
       </w:r>
     </w:p>
     <w:p>

</xml_diff>